<commit_message>
Add v2.0 supporting registers and make them mandatory in the policies
- Update the five v1.0 KMS logs (AML Incident Register, Compliance
  Breach Log, CDD Checklist, Risk Assessment Log, Training Log) to match
  the v2.0 policies, keeping their file format and house style.
- Add seven new registers the policies rely on: Complaints Register,
  Financial Promotions Log, Data Protection Registers, Conflicts and
  Gifts Registers, AML Business-Wide Risk Assessment, Compliance
  Monitoring Tracker and Consumer Duty Evidence.
- Registers include how-to tabs, drop-downs, calculated deadlines and
  scores, and deletable activity-specific OPTION rows.
- Policies now name each register exactly as the file/tab is named, drop
  "delete if you do not have it" wording, and carry a "Supporting
  registers" section stating that the registers are mandatory.

Co-Authored-By: Claude Opus 5.5 <noreply@anthropic.com>
Claude-Session: https://claude.ai/code/session_0185GJD35Lj4maZQfYQD6Tsw
</commit_message>
<xml_diff>
--- a/framework-templates/Anti_Money_Laundering_Policy_v2.0_Template.docx
+++ b/framework-templates/Anti_Money_Laundering_Policy_v2.0_Template.docx
@@ -300,6 +300,24 @@
           <w:b/>
           <w:bCs/>
         </w:rPr>
+        <w:t xml:space="preserve">Supporting registers are mandatory.</w:t>
+      </w:r>
+      <w:r>
+        <w:t xml:space="preserve"> This document relies on the KMS registers listed in its “Supporting registers” section (where it has one). The FCA judges a firm on the records that show its policies working in practice, so a firm that adopts this document without using its registers is likely to fail FCA scrutiny. Start using them from day one.</w:t>
+      </w:r>
+    </w:p>
+    <w:p>
+      <w:pPr>
+        <w:numPr>
+          <w:ilvl w:val="0"/>
+          <w:numId w:val="1"/>
+        </w:numPr>
+      </w:pPr>
+      <w:r>
+        <w:rPr>
+          <w:b/>
+          <w:bCs/>
+        </w:rPr>
         <w:t xml:space="preserve">Grey “KMS guidance” boxes</w:t>
       </w:r>
       <w:r>
@@ -596,15 +614,7 @@
         <w:t xml:space="preserve">1.2 Related documents.</w:t>
       </w:r>
       <w:r>
-        <w:t xml:space="preserve"> This policy should be read with our: Customer Due Diligence Policy; Business-Wide Risk Assessment; Compliance Monitoring Plan; Customer Vulnerability Policy; Training and Competence Policy; Data Processing Policy; and our registers (Customer Due Diligence Register, Internal Suspicious Activity Report Log and Sanctions Screening Log). </w:t>
-      </w:r>
-      <w:r>
-        <w:rPr>
-          <w:b/>
-          <w:bCs/>
-          <w:highlight w:val="yellow"/>
-        </w:rPr>
-        <w:t xml:space="preserve">[Delete any document or register you do not have, and make sure every document you list actually exists.]</w:t>
+        <w:t xml:space="preserve"> This policy should be read with our Customer Due Diligence Policy, Compliance Monitoring Plan, Customer Vulnerability Policy, Training and Competence Policy and Data Processing Policy. It is supported by the registers listed in section 13, which must be kept from our first day of trading.</w:t>
       </w:r>
     </w:p>
     <w:p>
@@ -3080,7 +3090,7 @@
     </w:p>
     <w:p>
       <w:r>
-        <w:t xml:space="preserve">The BWRA is reviewed at least annually and whenever there is a material change (for example a new product, channel or customer type). Its conclusions decide where we apply enhanced checks, how we target monitoring, and what our training covers. </w:t>
+        <w:t xml:space="preserve">The BWRA is reviewed at least annually and whenever there is a material change (for example a new product, channel or customer type). Its conclusions decide where we apply enhanced checks, how we target monitoring, and what our training covers. Our BWRA is recorded in the AML Business-Wide Risk Assessment workbook and was last approved by senior management on </w:t>
       </w:r>
       <w:r>
         <w:rPr>
@@ -3088,7 +3098,10 @@
           <w:bCs/>
           <w:highlight w:val="yellow"/>
         </w:rPr>
-        <w:t xml:space="preserve">[Insert the date of your current BWRA and where it is kept.]</w:t>
+        <w:t xml:space="preserve">[Insert date]</w:t>
+      </w:r>
+      <w:r>
+        <w:t xml:space="preserve">.</w:t>
       </w:r>
     </w:p>
     <w:p>
@@ -3267,7 +3280,7 @@
         </w:numPr>
       </w:pPr>
       <w:r>
-        <w:t xml:space="preserve">We keep records of screening, alerts and decisions in our Sanctions Screening Log.</w:t>
+        <w:t xml:space="preserve">We keep records of screening, alerts and decisions in our Sanctions Screening Log (in the Customer Due Diligence Checklist workbook).</w:t>
       </w:r>
     </w:p>
     <w:p>
@@ -3404,7 +3417,7 @@
         <w:t xml:space="preserve">8A.3 What the MLRO does.</w:t>
       </w:r>
       <w:r>
-        <w:t xml:space="preserve"> The MLRO acknowledges the report, reviews it against the information we hold, records their reasoning in the ISAR Log, and decides whether there is knowledge or suspicion requiring a report to the NCA. If so, the MLRO submits a Suspicious Activity Report (SAR) through the NCA’s online reporting portal as soon as practicable. The MLRO’s decision is theirs alone and must not be influenced by commercial considerations.</w:t>
+        <w:t xml:space="preserve"> The MLRO acknowledges the report, reviews it against the information we hold, records their reasoning in the AML Incident Register, and decides whether there is knowledge or suspicion requiring a report to the NCA. If so, the MLRO submits a Suspicious Activity Report (SAR) through the NCA’s online reporting portal as soon as practicable. The MLRO’s decision is theirs alone and must not be influenced by commercial considerations.</w:t>
       </w:r>
     </w:p>
     <w:p>
@@ -3440,7 +3453,7 @@
         <w:t xml:space="preserve">8A.6 Records.</w:t>
       </w:r>
       <w:r>
-        <w:t xml:space="preserve"> The MLRO keeps a confidential record of every ISAR, the MLRO’s decision and reasons, any SAR submitted (with its NCA reference) and any DAML correspondence, separate from customer files.</w:t>
+        <w:t xml:space="preserve"> The MLRO keeps a confidential record in the AML Incident Register of every ISAR, the MLRO’s decision and reasons, any SAR submitted (with its NCA reference) and any DAML correspondence, separate from customer files.</w:t>
       </w:r>
     </w:p>
     <w:p>
@@ -3597,7 +3610,7 @@
         <w:t xml:space="preserve">8B.6 Records.</w:t>
       </w:r>
       <w:r>
-        <w:t xml:space="preserve"> The MLRO keeps a confidential record of every internal report, their decision and reasons, and any SAR submitted, separate from customer files.</w:t>
+        <w:t xml:space="preserve"> The MLRO keeps a confidential record in the AML Incident Register of every internal report, their decision and reasons, and any SAR submitted, separate from customer files.</w:t>
       </w:r>
     </w:p>
     <w:p>
@@ -3785,7 +3798,7 @@
         <w:t xml:space="preserve">[Insert name or role]</w:t>
       </w:r>
       <w:r>
-        <w:t xml:space="preserve"> and recorded in our Gifts and Hospitality Register. Our procedures are proportionate to our risks, as the defence to the section 7 offence of the Bribery Act 2010 requires.</w:t>
+        <w:t xml:space="preserve"> and recorded in our Gifts and Hospitality Register (in the Conflicts and Gifts Registers workbook). Our procedures are proportionate to our risks, as the defence to the section 7 offence of the Bribery Act 2010 requires.</w:t>
       </w:r>
     </w:p>
     <w:p>
@@ -4070,6 +4083,490 @@
       <w:r>
         <w:t xml:space="preserve">.</w:t>
       </w:r>
+    </w:p>
+    <w:p>
+      <w:pPr>
+        <w:pStyle w:val="Heading20"/>
+        <w:outlineLvl w:val="0"/>
+      </w:pPr>
+      <w:r>
+        <w:t xml:space="preserve">13. Supporting registers</w:t>
+      </w:r>
+    </w:p>
+    <w:p>
+      <w:r>
+        <w:t xml:space="preserve">The KMS registers below support this policy. They are an essential part of it, not optional extras: the FCA judges whether a policy works in practice by looking at these records, and a policy without them is unlikely to withstand scrutiny. Keep them up to date from your first day of trading. The owner and review frequency are recorded in each register.</w:t>
+      </w:r>
+    </w:p>
+    <w:p>
+      <w:pPr>
+        <w:pBdr>
+          <w:top w:val="single" w:sz="4" w:space="4" w:color="11304F"/>
+          <w:left w:val="single" w:sz="24" w:space="4" w:color="11304F"/>
+          <w:bottom w:val="single" w:sz="4" w:space="4" w:color="11304F"/>
+          <w:right w:val="single" w:sz="4" w:space="4" w:color="11304F"/>
+        </w:pBdr>
+        <w:shd w:val="clear" w:color="auto" w:fill="F2F2F2"/>
+        <w:spacing w:before="120" w:after="120"/>
+        <w:ind w:left="113" w:right="113"/>
+      </w:pPr>
+      <w:r>
+        <w:rPr>
+          <w:b/>
+          <w:bCs/>
+        </w:rPr>
+        <w:t xml:space="preserve">KMS guidance: </w:t>
+      </w:r>
+      <w:r>
+        <w:rPr>
+          <w:i/>
+          <w:iCs/>
+        </w:rPr>
+        <w:t xml:space="preserve">Do not delete a register from this list because you have not started using it yet – start using it. Where one part of a register genuinely cannot apply to your firm (for example safeguarding when you hold no relevant funds), keep the register and record why that part does not apply.</w:t>
+      </w:r>
+    </w:p>
+    <w:tbl>
+      <w:tblPr>
+        <w:tblW w:w="9026" w:type="dxa"/>
+        <w:tblBorders>
+          <w:top w:val="single" w:sz="4" w:space="0" w:color="A6A6A6"/>
+          <w:left w:val="single" w:sz="4" w:space="0" w:color="A6A6A6"/>
+          <w:bottom w:val="single" w:sz="4" w:space="0" w:color="A6A6A6"/>
+          <w:right w:val="single" w:sz="4" w:space="0" w:color="A6A6A6"/>
+          <w:insideH w:val="single" w:sz="4" w:space="0" w:color="A6A6A6"/>
+          <w:insideV w:val="single" w:sz="4" w:space="0" w:color="A6A6A6"/>
+        </w:tblBorders>
+        <w:tblLayout w:type="fixed"/>
+        <w:tblCellMar>
+          <w:top w:w="57" w:type="dxa"/>
+          <w:left w:w="85" w:type="dxa"/>
+          <w:bottom w:w="57" w:type="dxa"/>
+          <w:right w:w="85" w:type="dxa"/>
+        </w:tblCellMar>
+        <w:tblLook w:val="04A0" w:firstRow="1" w:lastRow="0" w:firstColumn="0" w:lastColumn="0" w:noHBand="0" w:noVBand="1"/>
+      </w:tblPr>
+      <w:tblGrid>
+        <w:gridCol w:w="2527"/>
+        <w:gridCol w:w="2888"/>
+        <w:gridCol w:w="3611"/>
+      </w:tblGrid>
+      <w:tr>
+        <w:trPr>
+          <w:cantSplit/>
+          <w:tblHeader/>
+        </w:trPr>
+        <w:tc>
+          <w:tcPr>
+            <w:tcW w:w="2527" w:type="dxa"/>
+            <w:shd w:val="clear" w:color="auto" w:fill="D9E2F3"/>
+          </w:tcPr>
+          <w:p>
+            <w:pPr>
+              <w:spacing w:before="0" w:after="60"/>
+            </w:pPr>
+            <w:r>
+              <w:rPr>
+                <w:b/>
+                <w:bCs/>
+              </w:rPr>
+              <w:t xml:space="preserve">Register</w:t>
+            </w:r>
+          </w:p>
+        </w:tc>
+        <w:tc>
+          <w:tcPr>
+            <w:tcW w:w="2888" w:type="dxa"/>
+            <w:shd w:val="clear" w:color="auto" w:fill="D9E2F3"/>
+          </w:tcPr>
+          <w:p>
+            <w:pPr>
+              <w:spacing w:before="0" w:after="60"/>
+            </w:pPr>
+            <w:r>
+              <w:rPr>
+                <w:b/>
+                <w:bCs/>
+              </w:rPr>
+              <w:t xml:space="preserve">KMS file</w:t>
+            </w:r>
+          </w:p>
+        </w:tc>
+        <w:tc>
+          <w:tcPr>
+            <w:tcW w:w="3611" w:type="dxa"/>
+            <w:shd w:val="clear" w:color="auto" w:fill="D9E2F3"/>
+          </w:tcPr>
+          <w:p>
+            <w:pPr>
+              <w:spacing w:before="0" w:after="60"/>
+            </w:pPr>
+            <w:r>
+              <w:rPr>
+                <w:b/>
+                <w:bCs/>
+              </w:rPr>
+              <w:t xml:space="preserve">What it evidences</w:t>
+            </w:r>
+          </w:p>
+        </w:tc>
+      </w:tr>
+      <w:tr>
+        <w:trPr>
+          <w:cantSplit/>
+        </w:trPr>
+        <w:tc>
+          <w:tcPr>
+            <w:tcW w:w="2527" w:type="dxa"/>
+          </w:tcPr>
+          <w:p>
+            <w:pPr>
+              <w:spacing w:before="0" w:after="60"/>
+            </w:pPr>
+            <w:r>
+              <w:t xml:space="preserve">AML Incident Register</w:t>
+            </w:r>
+          </w:p>
+        </w:tc>
+        <w:tc>
+          <w:tcPr>
+            <w:tcW w:w="2888" w:type="dxa"/>
+          </w:tcPr>
+          <w:p>
+            <w:pPr>
+              <w:spacing w:before="0" w:after="60"/>
+            </w:pPr>
+            <w:r>
+              <w:t xml:space="preserve">Anti_Money_Laundering_Incident_Register_v2.0_Template.docx</w:t>
+            </w:r>
+          </w:p>
+        </w:tc>
+        <w:tc>
+          <w:tcPr>
+            <w:tcW w:w="3611" w:type="dxa"/>
+          </w:tcPr>
+          <w:p>
+            <w:pPr>
+              <w:spacing w:before="0" w:after="60"/>
+            </w:pPr>
+            <w:r>
+              <w:t xml:space="preserve">Every internal suspicious activity report, the MLRO’s reasoning and decision, SARs and DAML requests</w:t>
+            </w:r>
+          </w:p>
+        </w:tc>
+      </w:tr>
+      <w:tr>
+        <w:trPr>
+          <w:cantSplit/>
+        </w:trPr>
+        <w:tc>
+          <w:tcPr>
+            <w:tcW w:w="2527" w:type="dxa"/>
+          </w:tcPr>
+          <w:p>
+            <w:pPr>
+              <w:spacing w:before="0" w:after="60"/>
+            </w:pPr>
+            <w:r>
+              <w:t xml:space="preserve">CDD Checklist and EDD Checklist</w:t>
+            </w:r>
+          </w:p>
+        </w:tc>
+        <w:tc>
+          <w:tcPr>
+            <w:tcW w:w="2888" w:type="dxa"/>
+          </w:tcPr>
+          <w:p>
+            <w:pPr>
+              <w:spacing w:before="0" w:after="60"/>
+            </w:pPr>
+            <w:r>
+              <w:t xml:space="preserve">Customer_Due_Diligence_Checklist_v2.0_Template.xlsx</w:t>
+            </w:r>
+          </w:p>
+        </w:tc>
+        <w:tc>
+          <w:tcPr>
+            <w:tcW w:w="3611" w:type="dxa"/>
+          </w:tcPr>
+          <w:p>
+            <w:pPr>
+              <w:spacing w:before="0" w:after="60"/>
+            </w:pPr>
+            <w:r>
+              <w:t xml:space="preserve">Due diligence completed for each customer before onboarding</w:t>
+            </w:r>
+          </w:p>
+        </w:tc>
+      </w:tr>
+      <w:tr>
+        <w:trPr>
+          <w:cantSplit/>
+        </w:trPr>
+        <w:tc>
+          <w:tcPr>
+            <w:tcW w:w="2527" w:type="dxa"/>
+          </w:tcPr>
+          <w:p>
+            <w:pPr>
+              <w:spacing w:before="0" w:after="60"/>
+            </w:pPr>
+            <w:r>
+              <w:t xml:space="preserve">CDD Register</w:t>
+            </w:r>
+          </w:p>
+        </w:tc>
+        <w:tc>
+          <w:tcPr>
+            <w:tcW w:w="2888" w:type="dxa"/>
+          </w:tcPr>
+          <w:p>
+            <w:pPr>
+              <w:spacing w:before="0" w:after="60"/>
+            </w:pPr>
+            <w:r>
+              <w:t xml:space="preserve">Customer_Due_Diligence_Checklist_v2.0_Template.xlsx (CDD Register tab)</w:t>
+            </w:r>
+          </w:p>
+        </w:tc>
+        <w:tc>
+          <w:tcPr>
+            <w:tcW w:w="3611" w:type="dxa"/>
+          </w:tcPr>
+          <w:p>
+            <w:pPr>
+              <w:spacing w:before="0" w:after="60"/>
+            </w:pPr>
+            <w:r>
+              <w:t xml:space="preserve">Every customer’s verification, risk rating, screening, review and deletion dates</w:t>
+            </w:r>
+          </w:p>
+        </w:tc>
+      </w:tr>
+      <w:tr>
+        <w:trPr>
+          <w:cantSplit/>
+        </w:trPr>
+        <w:tc>
+          <w:tcPr>
+            <w:tcW w:w="2527" w:type="dxa"/>
+          </w:tcPr>
+          <w:p>
+            <w:pPr>
+              <w:spacing w:before="0" w:after="60"/>
+            </w:pPr>
+            <w:r>
+              <w:t xml:space="preserve">Sanctions Screening Log</w:t>
+            </w:r>
+          </w:p>
+        </w:tc>
+        <w:tc>
+          <w:tcPr>
+            <w:tcW w:w="2888" w:type="dxa"/>
+          </w:tcPr>
+          <w:p>
+            <w:pPr>
+              <w:spacing w:before="0" w:after="60"/>
+            </w:pPr>
+            <w:r>
+              <w:t xml:space="preserve">Customer_Due_Diligence_Checklist_v2.0_Template.xlsx (Sanctions Screening Log tab)</w:t>
+            </w:r>
+          </w:p>
+        </w:tc>
+        <w:tc>
+          <w:tcPr>
+            <w:tcW w:w="3611" w:type="dxa"/>
+          </w:tcPr>
+          <w:p>
+            <w:pPr>
+              <w:spacing w:before="0" w:after="60"/>
+            </w:pPr>
+            <w:r>
+              <w:t xml:space="preserve">Sanctions screening, potential matches and decisions, and OFSI reports</w:t>
+            </w:r>
+          </w:p>
+        </w:tc>
+      </w:tr>
+      <w:tr>
+        <w:trPr>
+          <w:cantSplit/>
+        </w:trPr>
+        <w:tc>
+          <w:tcPr>
+            <w:tcW w:w="2527" w:type="dxa"/>
+          </w:tcPr>
+          <w:p>
+            <w:pPr>
+              <w:spacing w:before="0" w:after="60"/>
+            </w:pPr>
+            <w:r>
+              <w:t xml:space="preserve">AML Business-Wide Risk Assessment</w:t>
+            </w:r>
+          </w:p>
+        </w:tc>
+        <w:tc>
+          <w:tcPr>
+            <w:tcW w:w="2888" w:type="dxa"/>
+          </w:tcPr>
+          <w:p>
+            <w:pPr>
+              <w:spacing w:before="0" w:after="60"/>
+            </w:pPr>
+            <w:r>
+              <w:t xml:space="preserve">AML_Business_Wide_Risk_Assessment_v2.0_Template.xlsx</w:t>
+            </w:r>
+          </w:p>
+        </w:tc>
+        <w:tc>
+          <w:tcPr>
+            <w:tcW w:w="3611" w:type="dxa"/>
+          </w:tcPr>
+          <w:p>
+            <w:pPr>
+              <w:spacing w:before="0" w:after="60"/>
+            </w:pPr>
+            <w:r>
+              <w:t xml:space="preserve">The firm-wide assessment of financial crime risk that drives our controls</w:t>
+            </w:r>
+          </w:p>
+        </w:tc>
+      </w:tr>
+      <w:tr>
+        <w:trPr>
+          <w:cantSplit/>
+        </w:trPr>
+        <w:tc>
+          <w:tcPr>
+            <w:tcW w:w="2527" w:type="dxa"/>
+          </w:tcPr>
+          <w:p>
+            <w:pPr>
+              <w:spacing w:before="0" w:after="60"/>
+            </w:pPr>
+            <w:r>
+              <w:t xml:space="preserve">Conflicts of Interest Register and Gifts and Hospitality Register</w:t>
+            </w:r>
+          </w:p>
+        </w:tc>
+        <w:tc>
+          <w:tcPr>
+            <w:tcW w:w="2888" w:type="dxa"/>
+          </w:tcPr>
+          <w:p>
+            <w:pPr>
+              <w:spacing w:before="0" w:after="60"/>
+            </w:pPr>
+            <w:r>
+              <w:t xml:space="preserve">Conflicts_and_Gifts_Registers_v2.0_Template.xlsx</w:t>
+            </w:r>
+          </w:p>
+        </w:tc>
+        <w:tc>
+          <w:tcPr>
+            <w:tcW w:w="3611" w:type="dxa"/>
+          </w:tcPr>
+          <w:p>
+            <w:pPr>
+              <w:spacing w:before="0" w:after="60"/>
+            </w:pPr>
+            <w:r>
+              <w:t xml:space="preserve">Conflicts identified and managed; gifts and hospitality approved and recorded</w:t>
+            </w:r>
+          </w:p>
+        </w:tc>
+      </w:tr>
+      <w:tr>
+        <w:trPr>
+          <w:cantSplit/>
+        </w:trPr>
+        <w:tc>
+          <w:tcPr>
+            <w:tcW w:w="2527" w:type="dxa"/>
+          </w:tcPr>
+          <w:p>
+            <w:pPr>
+              <w:spacing w:before="0" w:after="60"/>
+            </w:pPr>
+            <w:r>
+              <w:t xml:space="preserve">Compliance Breach Log</w:t>
+            </w:r>
+          </w:p>
+        </w:tc>
+        <w:tc>
+          <w:tcPr>
+            <w:tcW w:w="2888" w:type="dxa"/>
+          </w:tcPr>
+          <w:p>
+            <w:pPr>
+              <w:spacing w:before="0" w:after="60"/>
+            </w:pPr>
+            <w:r>
+              <w:t xml:space="preserve">Compliance_Breach_Log_v2.0_Template.xlsx</w:t>
+            </w:r>
+          </w:p>
+        </w:tc>
+        <w:tc>
+          <w:tcPr>
+            <w:tcW w:w="3611" w:type="dxa"/>
+          </w:tcPr>
+          <w:p>
+            <w:pPr>
+              <w:spacing w:before="0" w:after="60"/>
+            </w:pPr>
+            <w:r>
+              <w:t xml:space="preserve">Every breach, its root cause, customer impact, FCA notification decision and remediation</w:t>
+            </w:r>
+          </w:p>
+        </w:tc>
+      </w:tr>
+      <w:tr>
+        <w:trPr>
+          <w:cantSplit/>
+        </w:trPr>
+        <w:tc>
+          <w:tcPr>
+            <w:tcW w:w="2527" w:type="dxa"/>
+          </w:tcPr>
+          <w:p>
+            <w:pPr>
+              <w:spacing w:before="0" w:after="60"/>
+            </w:pPr>
+            <w:r>
+              <w:t xml:space="preserve">Training Log (Training Matrix, Training Record, Competence Register, CPD Log)</w:t>
+            </w:r>
+          </w:p>
+        </w:tc>
+        <w:tc>
+          <w:tcPr>
+            <w:tcW w:w="2888" w:type="dxa"/>
+          </w:tcPr>
+          <w:p>
+            <w:pPr>
+              <w:spacing w:before="0" w:after="60"/>
+            </w:pPr>
+            <w:r>
+              <w:t xml:space="preserve">Training_Log_v2.0_Template.xlsx</w:t>
+            </w:r>
+          </w:p>
+        </w:tc>
+        <w:tc>
+          <w:tcPr>
+            <w:tcW w:w="3611" w:type="dxa"/>
+          </w:tcPr>
+          <w:p>
+            <w:pPr>
+              <w:spacing w:before="0" w:after="60"/>
+            </w:pPr>
+            <w:r>
+              <w:t xml:space="preserve">Training completed, competence assessed, supervision, qualifications and CPD</w:t>
+            </w:r>
+          </w:p>
+        </w:tc>
+      </w:tr>
+    </w:tbl>
+    <w:p>
+      <w:pPr>
+        <w:spacing w:before="0" w:after="0"/>
+      </w:pPr>
     </w:p>
     <w:sectPr>
       <w:pgSz w:w="11906" w:h="16838"/>

</xml_diff>